<commit_message>
Update food report templates
</commit_message>
<xml_diff>
--- a/src/assets/report/relatorio_alecrim.docx
+++ b/src/assets/report/relatorio_alecrim.docx
@@ -1862,21 +1862,7 @@
             <w:vAlign w:val="center"/>
           </w:tcPr>
           <w:p>
-            <w:pPr>
-              <w:spacing w:after="0" w:line="240" w:lineRule="auto"/>
-              <w:jc w:val="center"/>
-              <w:rPr>
-                <w:rFonts w:ascii="Calibri" w:eastAsia="Calibri" w:hAnsi="Calibri" w:cs="Calibri"/>
-                <w:sz w:val="20"/>
-                <w:szCs w:val="20"/>
-              </w:rPr>
-            </w:pPr>
-            <w:r>
-              <w:rPr>
-                <w:rFonts w:ascii="Calibri" w:eastAsia="Calibri" w:hAnsi="Calibri" w:cs="Calibri"/>
-                <w:sz w:val="20"/>
-                <w:szCs w:val="20"/>
-              </w:rPr>
+            <w:r>
               <w:t>Alimentos</w:t>
             </w:r>
           </w:p>
@@ -1893,23 +1879,7 @@
             </w:tcMar>
           </w:tcPr>
           <w:p>
-            <w:pPr>
-              <w:spacing w:after="0" w:line="240" w:lineRule="auto"/>
-              <w:jc w:val="center"/>
-              <w:rPr>
-                <w:rFonts w:ascii="Calibri" w:eastAsia="Calibri" w:hAnsi="Calibri" w:cs="Calibri"/>
-                <w:b/>
-                <w:bCs/>
-                <w:sz w:val="20"/>
-                <w:szCs w:val="20"/>
-              </w:rPr>
-            </w:pPr>
-            <w:r>
-              <w:rPr>
-                <w:rFonts w:ascii="Calibri" w:eastAsia="Calibri" w:hAnsi="Calibri" w:cs="Calibri"/>
-                <w:sz w:val="20"/>
-                <w:szCs w:val="20"/>
-              </w:rPr>
+            <w:r>
               <w:t>0 – 0,300</w:t>
             </w:r>
           </w:p>
@@ -1927,24 +1897,7 @@
             <w:vAlign w:val="center"/>
           </w:tcPr>
           <w:p>
-            <w:pPr>
-              <w:spacing w:after="0" w:line="240" w:lineRule="auto"/>
-              <w:rPr>
-                <w:rFonts w:ascii="Calibri" w:eastAsia="Calibri" w:hAnsi="Calibri" w:cs="Calibri"/>
-                <w:b/>
-                <w:bCs/>
-                <w:sz w:val="20"/>
-                <w:szCs w:val="20"/>
-                <w:lang w:val="pt-BR"/>
-              </w:rPr>
-            </w:pPr>
-            <w:r>
-              <w:rPr>
-                <w:rFonts w:ascii="Calibri" w:eastAsia="Calibri" w:hAnsi="Calibri" w:cs="Calibri"/>
-                <w:sz w:val="20"/>
-                <w:szCs w:val="20"/>
-                <w:lang w:val="pt-BR"/>
-              </w:rPr>
+            <w:r>
               <w:t>Altamente compatível – alimento benéfico, harmonizador.</w:t>
             </w:r>
           </w:p>
@@ -1992,23 +1945,7 @@
             </w:tcMar>
           </w:tcPr>
           <w:p>
-            <w:pPr>
-              <w:spacing w:after="0" w:line="240" w:lineRule="auto"/>
-              <w:jc w:val="center"/>
-              <w:rPr>
-                <w:rFonts w:ascii="Calibri" w:eastAsia="Calibri" w:hAnsi="Calibri" w:cs="Calibri"/>
-                <w:b/>
-                <w:bCs/>
-                <w:sz w:val="20"/>
-                <w:szCs w:val="20"/>
-              </w:rPr>
-            </w:pPr>
-            <w:r>
-              <w:rPr>
-                <w:rFonts w:ascii="Calibri" w:eastAsia="Calibri" w:hAnsi="Calibri" w:cs="Calibri"/>
-                <w:sz w:val="20"/>
-                <w:szCs w:val="20"/>
-              </w:rPr>
+            <w:r>
               <w:t>0,300 – 0,700</w:t>
             </w:r>
           </w:p>
@@ -2026,24 +1963,7 @@
             <w:vAlign w:val="center"/>
           </w:tcPr>
           <w:p>
-            <w:pPr>
-              <w:spacing w:after="0" w:line="240" w:lineRule="auto"/>
-              <w:rPr>
-                <w:rFonts w:ascii="Calibri" w:eastAsia="Calibri" w:hAnsi="Calibri" w:cs="Calibri"/>
-                <w:b/>
-                <w:bCs/>
-                <w:sz w:val="20"/>
-                <w:szCs w:val="20"/>
-                <w:lang w:val="pt-BR"/>
-              </w:rPr>
-            </w:pPr>
-            <w:r>
-              <w:rPr>
-                <w:rFonts w:ascii="Calibri" w:eastAsia="Calibri" w:hAnsi="Calibri" w:cs="Calibri"/>
-                <w:sz w:val="20"/>
-                <w:szCs w:val="20"/>
-                <w:lang w:val="pt-BR"/>
-              </w:rPr>
+            <w:r>
               <w:t>Compatível – pode ser consumido com moderação.</w:t>
             </w:r>
           </w:p>
@@ -2094,23 +2014,7 @@
             </w:tcMar>
           </w:tcPr>
           <w:p>
-            <w:pPr>
-              <w:spacing w:after="0" w:line="240" w:lineRule="auto"/>
-              <w:jc w:val="center"/>
-              <w:rPr>
-                <w:rFonts w:ascii="Calibri" w:eastAsia="Calibri" w:hAnsi="Calibri" w:cs="Calibri"/>
-                <w:b/>
-                <w:bCs/>
-                <w:sz w:val="20"/>
-                <w:szCs w:val="20"/>
-              </w:rPr>
-            </w:pPr>
-            <w:r>
-              <w:rPr>
-                <w:rFonts w:ascii="Calibri" w:eastAsia="Calibri" w:hAnsi="Calibri" w:cs="Calibri"/>
-                <w:sz w:val="20"/>
-                <w:szCs w:val="20"/>
-              </w:rPr>
+            <w:r>
               <w:t>0,710 -1,000</w:t>
             </w:r>
           </w:p>
@@ -2128,22 +2032,7 @@
             <w:vAlign w:val="center"/>
           </w:tcPr>
           <w:p>
-            <w:pPr>
-              <w:spacing w:after="0" w:line="240" w:lineRule="auto"/>
-              <w:rPr>
-                <w:rFonts w:ascii="Calibri" w:eastAsia="Calibri" w:hAnsi="Calibri" w:cs="Calibri"/>
-                <w:sz w:val="20"/>
-                <w:szCs w:val="20"/>
-                <w:lang w:val="pt-BR"/>
-              </w:rPr>
-            </w:pPr>
-            <w:r>
-              <w:rPr>
-                <w:rFonts w:ascii="Calibri" w:eastAsia="Calibri" w:hAnsi="Calibri" w:cs="Calibri"/>
-                <w:sz w:val="20"/>
-                <w:szCs w:val="20"/>
-                <w:lang w:val="pt-BR"/>
-              </w:rPr>
+            <w:r>
               <w:t>Pouco compatível – pode gerar leve estresse biológico.</w:t>
             </w:r>
           </w:p>
@@ -2189,23 +2078,7 @@
             </w:tcMar>
           </w:tcPr>
           <w:p>
-            <w:pPr>
-              <w:spacing w:after="0" w:line="240" w:lineRule="auto"/>
-              <w:jc w:val="center"/>
-              <w:rPr>
-                <w:rFonts w:ascii="Calibri" w:eastAsia="Calibri" w:hAnsi="Calibri" w:cs="Calibri"/>
-                <w:b/>
-                <w:bCs/>
-                <w:sz w:val="20"/>
-                <w:szCs w:val="20"/>
-              </w:rPr>
-            </w:pPr>
-            <w:r>
-              <w:rPr>
-                <w:rFonts w:ascii="Calibri" w:eastAsia="Calibri" w:hAnsi="Calibri" w:cs="Calibri"/>
-                <w:sz w:val="20"/>
-                <w:szCs w:val="20"/>
-              </w:rPr>
+            <w:r>
               <w:t>&gt;1,000</w:t>
             </w:r>
           </w:p>
@@ -2223,24 +2096,7 @@
             <w:vAlign w:val="center"/>
           </w:tcPr>
           <w:p>
-            <w:pPr>
-              <w:spacing w:after="0" w:line="240" w:lineRule="auto"/>
-              <w:rPr>
-                <w:rFonts w:ascii="Calibri" w:eastAsia="Calibri" w:hAnsi="Calibri" w:cs="Calibri"/>
-                <w:b/>
-                <w:bCs/>
-                <w:sz w:val="20"/>
-                <w:szCs w:val="20"/>
-                <w:lang w:val="pt-BR"/>
-              </w:rPr>
-            </w:pPr>
-            <w:r>
-              <w:rPr>
-                <w:rFonts w:ascii="Calibri" w:eastAsia="Calibri" w:hAnsi="Calibri" w:cs="Calibri"/>
-                <w:sz w:val="20"/>
-                <w:szCs w:val="20"/>
-                <w:lang w:val="pt-BR"/>
-              </w:rPr>
+            <w:r>
               <w:t>Incompatível – potencial alergênico, inflamatório ou intoxicante.</w:t>
             </w:r>
           </w:p>
@@ -4186,6 +4042,8 @@
         <w:gridCol w:w="850"/>
         <w:gridCol w:w="2694"/>
         <w:gridCol w:w="848"/>
+        <w:gridCol w:w="936"/>
+        <w:gridCol w:w="936"/>
       </w:tblGrid>
       <w:tr>
         <w:trPr>
@@ -4193,8 +4051,8 @@
         </w:trPr>
         <w:tc>
           <w:tcPr>
-            <w:tcW w:w="10632" w:type="dxa"/>
-            <w:gridSpan w:val="6"/>
+            <w:tcW w:w="12504" w:type="dxa"/>
+            <w:gridSpan w:val="8"/>
             <w:tcBorders>
               <w:top w:val="single" w:sz="4" w:space="0" w:color="000000"/>
               <w:left w:val="single" w:sz="4" w:space="0" w:color="000000"/>
@@ -4205,22 +4063,7 @@
             <w:hideMark/>
           </w:tcPr>
           <w:p>
-            <w:pPr>
-              <w:widowControl w:val="0"/>
-              <w:spacing w:after="0"/>
-              <w:jc w:val="center"/>
-              <w:rPr>
-                <w:rFonts w:ascii="Calibri" w:eastAsia="Calibri" w:hAnsi="Calibri" w:cs="Calibri"/>
-                <w:b/>
-                <w:bCs/>
-              </w:rPr>
-            </w:pPr>
-            <w:r>
-              <w:rPr>
-                <w:rFonts w:ascii="Calibri" w:eastAsia="Calibri" w:hAnsi="Calibri" w:cs="Calibri"/>
-                <w:b/>
-                <w:bCs/>
-              </w:rPr>
+            <w:r>
               <w:t>ALIMENTOS</w:t>
             </w:r>
           </w:p>
@@ -4243,23 +4086,8 @@
             <w:hideMark/>
           </w:tcPr>
           <w:p>
-            <w:pPr>
-              <w:widowControl w:val="0"/>
-              <w:spacing w:after="0"/>
-              <w:jc w:val="center"/>
-              <w:rPr>
-                <w:rFonts w:ascii="Calibri" w:eastAsia="Calibri" w:hAnsi="Calibri" w:cs="Calibri"/>
-                <w:b/>
-                <w:bCs/>
-              </w:rPr>
-            </w:pPr>
-            <w:r>
-              <w:rPr>
-                <w:rFonts w:ascii="Calibri" w:eastAsia="Calibri" w:hAnsi="Calibri" w:cs="Calibri"/>
-                <w:b/>
-                <w:bCs/>
-              </w:rPr>
-              <w:t>ALTAMENTE COMPATÍVEIS</w:t>
+            <w:r>
+              <w:t>ALTAMENTE COMPATÍVEL</w:t>
             </w:r>
           </w:p>
         </w:tc>
@@ -4276,22 +4104,7 @@
             <w:hideMark/>
           </w:tcPr>
           <w:p>
-            <w:pPr>
-              <w:widowControl w:val="0"/>
-              <w:spacing w:after="0"/>
-              <w:jc w:val="center"/>
-              <w:rPr>
-                <w:rFonts w:ascii="Calibri" w:eastAsia="Calibri" w:hAnsi="Calibri" w:cs="Calibri"/>
-                <w:b/>
-                <w:bCs/>
-              </w:rPr>
-            </w:pPr>
-            <w:r>
-              <w:rPr>
-                <w:rFonts w:ascii="Calibri" w:eastAsia="Calibri" w:hAnsi="Calibri" w:cs="Calibri"/>
-                <w:b/>
-                <w:bCs/>
-              </w:rPr>
+            <w:r>
               <w:t>D</w:t>
             </w:r>
           </w:p>
@@ -4309,23 +4122,8 @@
             <w:hideMark/>
           </w:tcPr>
           <w:p>
-            <w:pPr>
-              <w:widowControl w:val="0"/>
-              <w:spacing w:after="0"/>
-              <w:jc w:val="center"/>
-              <w:rPr>
-                <w:rFonts w:ascii="Calibri" w:eastAsia="Calibri" w:hAnsi="Calibri" w:cs="Calibri"/>
-                <w:b/>
-                <w:bCs/>
-              </w:rPr>
-            </w:pPr>
-            <w:r>
-              <w:rPr>
-                <w:rFonts w:ascii="Calibri" w:eastAsia="Calibri" w:hAnsi="Calibri" w:cs="Calibri"/>
-                <w:b/>
-                <w:bCs/>
-              </w:rPr>
-              <w:t>COMPATÍVEIS</w:t>
+            <w:r>
+              <w:t>COMPATÍVEL</w:t>
             </w:r>
           </w:p>
         </w:tc>
@@ -4342,22 +4140,7 @@
             <w:hideMark/>
           </w:tcPr>
           <w:p>
-            <w:pPr>
-              <w:widowControl w:val="0"/>
-              <w:spacing w:after="0"/>
-              <w:jc w:val="center"/>
-              <w:rPr>
-                <w:rFonts w:ascii="Calibri" w:eastAsia="Calibri" w:hAnsi="Calibri" w:cs="Calibri"/>
-                <w:b/>
-                <w:bCs/>
-              </w:rPr>
-            </w:pPr>
-            <w:r>
-              <w:rPr>
-                <w:rFonts w:ascii="Calibri" w:eastAsia="Calibri" w:hAnsi="Calibri" w:cs="Calibri"/>
-                <w:b/>
-                <w:bCs/>
-              </w:rPr>
+            <w:r>
               <w:t>D</w:t>
             </w:r>
           </w:p>
@@ -4375,33 +4158,8 @@
             <w:hideMark/>
           </w:tcPr>
           <w:p>
-            <w:pPr>
-              <w:widowControl w:val="0"/>
-              <w:spacing w:after="0"/>
-              <w:jc w:val="center"/>
-              <w:rPr>
-                <w:rFonts w:ascii="Calibri" w:eastAsia="Calibri" w:hAnsi="Calibri" w:cs="Calibri"/>
-                <w:b/>
-                <w:bCs/>
-              </w:rPr>
-            </w:pPr>
-            <w:proofErr w:type="gramStart"/>
-            <w:r>
-              <w:rPr>
-                <w:rFonts w:ascii="Calibri" w:eastAsia="Calibri" w:hAnsi="Calibri" w:cs="Calibri"/>
-                <w:b/>
-                <w:bCs/>
-              </w:rPr>
-              <w:t>A</w:t>
-            </w:r>
-            <w:proofErr w:type="gramEnd"/>
-            <w:r>
-              <w:rPr>
-                <w:rFonts w:ascii="Calibri" w:eastAsia="Calibri" w:hAnsi="Calibri" w:cs="Calibri"/>
-                <w:b/>
-                <w:bCs/>
-              </w:rPr>
-              <w:t xml:space="preserve"> EVITAR</w:t>
+            <w:r>
+              <w:t>POUCO COMPATÍVEL</w:t>
             </w:r>
           </w:p>
         </w:tc>
@@ -4418,22 +4176,27 @@
             <w:hideMark/>
           </w:tcPr>
           <w:p>
-            <w:pPr>
-              <w:widowControl w:val="0"/>
-              <w:spacing w:after="0"/>
-              <w:jc w:val="center"/>
-              <w:rPr>
-                <w:rFonts w:ascii="Calibri" w:eastAsia="Calibri" w:hAnsi="Calibri" w:cs="Calibri"/>
-                <w:b/>
-                <w:bCs/>
-              </w:rPr>
-            </w:pPr>
-            <w:r>
-              <w:rPr>
-                <w:rFonts w:ascii="Calibri" w:eastAsia="Calibri" w:hAnsi="Calibri" w:cs="Calibri"/>
-                <w:b/>
-                <w:bCs/>
-              </w:rPr>
+            <w:r>
+              <w:t>D</w:t>
+            </w:r>
+          </w:p>
+        </w:tc>
+        <w:tc>
+          <w:tcPr>
+            <w:tcW w:type="dxa" w:w="936"/>
+          </w:tcPr>
+          <w:p>
+            <w:r>
+              <w:t>INCOMPATÍVEL</w:t>
+            </w:r>
+          </w:p>
+        </w:tc>
+        <w:tc>
+          <w:tcPr>
+            <w:tcW w:type="dxa" w:w="936"/>
+          </w:tcPr>
+          <w:p>
+            <w:r>
               <w:t>D</w:t>
             </w:r>
           </w:p>
@@ -4445,8 +4208,8 @@
         </w:trPr>
         <w:tc>
           <w:tcPr>
-            <w:tcW w:w="10632" w:type="dxa"/>
-            <w:gridSpan w:val="6"/>
+            <w:tcW w:w="12504" w:type="dxa"/>
+            <w:gridSpan w:val="8"/>
             <w:tcBorders>
               <w:top w:val="single" w:sz="4" w:space="0" w:color="000000"/>
               <w:left w:val="single" w:sz="4" w:space="0" w:color="000000"/>
@@ -4456,52 +4219,8 @@
             <w:shd w:val="clear" w:color="auto" w:fill="F2F2F2" w:themeFill="background1" w:themeFillShade="F2"/>
           </w:tcPr>
           <w:p>
-            <w:pPr>
-              <w:widowControl w:val="0"/>
-              <w:spacing w:after="0"/>
-              <w:rPr>
-                <w:rFonts w:ascii="Calibri" w:eastAsia="Calibri" w:hAnsi="Calibri" w:cs="Calibri"/>
-                <w:b/>
-                <w:bCs/>
-              </w:rPr>
-            </w:pPr>
-            <w:r>
-              <w:rPr>
-                <w:rFonts w:ascii="Calibri" w:eastAsia="Calibri" w:hAnsi="Calibri" w:cs="Calibri"/>
-              </w:rPr>
-              <w:t xml:space="preserve">{%tr for </w:t>
-            </w:r>
-            <w:r>
-              <w:rPr>
-                <w:rFonts w:ascii="Calibri" w:eastAsia="Calibri" w:hAnsi="Calibri" w:cs="Calibri"/>
-              </w:rPr>
-              <w:t xml:space="preserve">row </w:t>
-            </w:r>
-            <w:r>
-              <w:rPr>
-                <w:rFonts w:ascii="Calibri" w:eastAsia="Calibri" w:hAnsi="Calibri" w:cs="Calibri"/>
-              </w:rPr>
-              <w:t xml:space="preserve">in </w:t>
-            </w:r>
-            <w:proofErr w:type="spellStart"/>
-            <w:r>
-              <w:rPr>
-                <w:rFonts w:ascii="Calibri" w:eastAsia="Calibri" w:hAnsi="Calibri" w:cs="Calibri"/>
-              </w:rPr>
-              <w:t>table_</w:t>
-            </w:r>
-            <w:r>
-              <w:rPr>
-                <w:rFonts w:ascii="Calibri" w:eastAsia="Calibri" w:hAnsi="Calibri" w:cs="Calibri"/>
-              </w:rPr>
-              <w:t>food</w:t>
-            </w:r>
-            <w:proofErr w:type="spellEnd"/>
-            <w:r>
-              <w:rPr>
-                <w:rFonts w:ascii="Calibri" w:eastAsia="Calibri" w:hAnsi="Calibri" w:cs="Calibri"/>
-              </w:rPr>
-              <w:t>%}</w:t>
+            <w:r>
+              <w:t>{%tr for row in table_food%}</w:t>
             </w:r>
           </w:p>
         </w:tc>
@@ -4518,44 +4237,8 @@
             </w:tcBorders>
           </w:tcPr>
           <w:p>
-            <w:pPr>
-              <w:widowControl w:val="0"/>
-              <w:spacing w:after="0"/>
-              <w:rPr>
-                <w:rFonts w:ascii="Calibri" w:eastAsia="Calibri" w:hAnsi="Calibri" w:cs="Calibri"/>
-              </w:rPr>
-            </w:pPr>
-            <w:r>
-              <w:rPr>
-                <w:rFonts w:ascii="Calibri" w:eastAsia="Calibri" w:hAnsi="Calibri" w:cs="Calibri"/>
-              </w:rPr>
-              <w:t>{{</w:t>
-            </w:r>
-            <w:proofErr w:type="gramStart"/>
-            <w:r>
-              <w:rPr>
-                <w:rFonts w:ascii="Calibri" w:eastAsia="Calibri" w:hAnsi="Calibri" w:cs="Calibri"/>
-              </w:rPr>
-              <w:t>row</w:t>
-            </w:r>
-            <w:r>
-              <w:rPr>
-                <w:rFonts w:ascii="Calibri" w:eastAsia="Calibri" w:hAnsi="Calibri" w:cs="Calibri"/>
-              </w:rPr>
-              <w:t>[</w:t>
-            </w:r>
-            <w:proofErr w:type="gramEnd"/>
-            <w:r>
-              <w:rPr>
-                <w:rFonts w:ascii="Calibri" w:eastAsia="Calibri" w:hAnsi="Calibri" w:cs="Calibri"/>
-              </w:rPr>
-              <w:t>0]</w:t>
-            </w:r>
-            <w:r>
-              <w:rPr>
-                <w:rFonts w:ascii="Calibri" w:eastAsia="Calibri" w:hAnsi="Calibri" w:cs="Calibri"/>
-              </w:rPr>
-              <w:t>}}</w:t>
+            <w:r>
+              <w:t>{{row[0]}}</w:t>
             </w:r>
           </w:p>
         </w:tc>
@@ -4570,38 +4253,8 @@
             </w:tcBorders>
           </w:tcPr>
           <w:p>
-            <w:pPr>
-              <w:widowControl w:val="0"/>
-              <w:spacing w:after="0"/>
-              <w:rPr>
-                <w:rFonts w:ascii="Calibri" w:eastAsia="Calibri" w:hAnsi="Calibri" w:cs="Calibri"/>
-              </w:rPr>
-            </w:pPr>
-            <w:proofErr w:type="gramStart"/>
-            <w:r>
-              <w:rPr>
-                <w:rFonts w:ascii="Calibri" w:eastAsia="Calibri" w:hAnsi="Calibri" w:cs="Calibri"/>
-              </w:rPr>
-              <w:t>{{</w:t>
-            </w:r>
-            <w:r>
-              <w:rPr>
-                <w:rFonts w:ascii="Calibri" w:eastAsia="Calibri" w:hAnsi="Calibri" w:cs="Calibri"/>
-              </w:rPr>
-              <w:t xml:space="preserve"> row</w:t>
-            </w:r>
-            <w:proofErr w:type="gramEnd"/>
-            <w:r>
-              <w:rPr>
-                <w:rFonts w:ascii="Calibri" w:eastAsia="Calibri" w:hAnsi="Calibri" w:cs="Calibri"/>
-              </w:rPr>
-              <w:t>[1]</w:t>
-            </w:r>
-            <w:r>
-              <w:rPr>
-                <w:rFonts w:ascii="Calibri" w:eastAsia="Calibri" w:hAnsi="Calibri" w:cs="Calibri"/>
-              </w:rPr>
-              <w:t>}}</w:t>
+            <w:r>
+              <w:t>{{ row[1]}}</w:t>
             </w:r>
           </w:p>
         </w:tc>
@@ -4616,38 +4269,8 @@
             </w:tcBorders>
           </w:tcPr>
           <w:p>
-            <w:pPr>
-              <w:widowControl w:val="0"/>
-              <w:spacing w:after="0"/>
-              <w:rPr>
-                <w:rFonts w:ascii="Calibri" w:eastAsia="Calibri" w:hAnsi="Calibri" w:cs="Calibri"/>
-              </w:rPr>
-            </w:pPr>
-            <w:r>
-              <w:rPr>
-                <w:rFonts w:ascii="Calibri" w:eastAsia="Calibri" w:hAnsi="Calibri" w:cs="Calibri"/>
-              </w:rPr>
-              <w:t>{{</w:t>
-            </w:r>
-            <w:proofErr w:type="gramStart"/>
-            <w:r>
-              <w:rPr>
-                <w:rFonts w:ascii="Calibri" w:eastAsia="Calibri" w:hAnsi="Calibri" w:cs="Calibri"/>
-              </w:rPr>
-              <w:t>row[</w:t>
-            </w:r>
-            <w:proofErr w:type="gramEnd"/>
-            <w:r>
-              <w:rPr>
-                <w:rFonts w:ascii="Calibri" w:eastAsia="Calibri" w:hAnsi="Calibri" w:cs="Calibri"/>
-              </w:rPr>
-              <w:t>2]</w:t>
-            </w:r>
-            <w:r>
-              <w:rPr>
-                <w:rFonts w:ascii="Calibri" w:eastAsia="Calibri" w:hAnsi="Calibri" w:cs="Calibri"/>
-              </w:rPr>
-              <w:t>}}</w:t>
+            <w:r>
+              <w:t>{{row[2]}}</w:t>
             </w:r>
           </w:p>
         </w:tc>
@@ -4662,38 +4285,8 @@
             </w:tcBorders>
           </w:tcPr>
           <w:p>
-            <w:pPr>
-              <w:widowControl w:val="0"/>
-              <w:spacing w:after="0"/>
-              <w:rPr>
-                <w:rFonts w:ascii="Calibri" w:eastAsia="Calibri" w:hAnsi="Calibri" w:cs="Calibri"/>
-              </w:rPr>
-            </w:pPr>
-            <w:proofErr w:type="gramStart"/>
-            <w:r>
-              <w:rPr>
-                <w:rFonts w:ascii="Calibri" w:eastAsia="Calibri" w:hAnsi="Calibri" w:cs="Calibri"/>
-              </w:rPr>
-              <w:t>{{</w:t>
-            </w:r>
-            <w:r>
-              <w:rPr>
-                <w:rFonts w:ascii="Calibri" w:eastAsia="Calibri" w:hAnsi="Calibri" w:cs="Calibri"/>
-              </w:rPr>
-              <w:t xml:space="preserve"> row</w:t>
-            </w:r>
-            <w:proofErr w:type="gramEnd"/>
-            <w:r>
-              <w:rPr>
-                <w:rFonts w:ascii="Calibri" w:eastAsia="Calibri" w:hAnsi="Calibri" w:cs="Calibri"/>
-              </w:rPr>
-              <w:t>[3]</w:t>
-            </w:r>
-            <w:r>
-              <w:rPr>
-                <w:rFonts w:ascii="Calibri" w:eastAsia="Calibri" w:hAnsi="Calibri" w:cs="Calibri"/>
-              </w:rPr>
-              <w:t>}}</w:t>
+            <w:r>
+              <w:t>{{ row[3]}}</w:t>
             </w:r>
           </w:p>
         </w:tc>
@@ -4708,38 +4301,8 @@
             </w:tcBorders>
           </w:tcPr>
           <w:p>
-            <w:pPr>
-              <w:widowControl w:val="0"/>
-              <w:spacing w:after="0"/>
-              <w:rPr>
-                <w:rFonts w:ascii="Calibri" w:eastAsia="Calibri" w:hAnsi="Calibri" w:cs="Calibri"/>
-              </w:rPr>
-            </w:pPr>
-            <w:proofErr w:type="gramStart"/>
-            <w:r>
-              <w:rPr>
-                <w:rFonts w:ascii="Calibri" w:eastAsia="Calibri" w:hAnsi="Calibri" w:cs="Calibri"/>
-              </w:rPr>
-              <w:t>{{</w:t>
-            </w:r>
-            <w:r>
-              <w:rPr>
-                <w:rFonts w:ascii="Calibri" w:eastAsia="Calibri" w:hAnsi="Calibri" w:cs="Calibri"/>
-              </w:rPr>
-              <w:t xml:space="preserve"> row</w:t>
-            </w:r>
-            <w:proofErr w:type="gramEnd"/>
-            <w:r>
-              <w:rPr>
-                <w:rFonts w:ascii="Calibri" w:eastAsia="Calibri" w:hAnsi="Calibri" w:cs="Calibri"/>
-              </w:rPr>
-              <w:t>[4]</w:t>
-            </w:r>
-            <w:r>
-              <w:rPr>
-                <w:rFonts w:ascii="Calibri" w:eastAsia="Calibri" w:hAnsi="Calibri" w:cs="Calibri"/>
-              </w:rPr>
-              <w:t>}}</w:t>
+            <w:r>
+              <w:t>{{row[4]}}</w:t>
             </w:r>
           </w:p>
         </w:tc>
@@ -4754,38 +4317,28 @@
             </w:tcBorders>
           </w:tcPr>
           <w:p>
-            <w:pPr>
-              <w:widowControl w:val="0"/>
-              <w:spacing w:after="0"/>
-              <w:rPr>
-                <w:rFonts w:ascii="Calibri" w:eastAsia="Calibri" w:hAnsi="Calibri" w:cs="Calibri"/>
-              </w:rPr>
-            </w:pPr>
-            <w:proofErr w:type="gramStart"/>
-            <w:r>
-              <w:rPr>
-                <w:rFonts w:ascii="Calibri" w:eastAsia="Calibri" w:hAnsi="Calibri" w:cs="Calibri"/>
-              </w:rPr>
-              <w:t>{{</w:t>
-            </w:r>
-            <w:r>
-              <w:rPr>
-                <w:rFonts w:ascii="Calibri" w:eastAsia="Calibri" w:hAnsi="Calibri" w:cs="Calibri"/>
-              </w:rPr>
-              <w:t xml:space="preserve"> row</w:t>
-            </w:r>
-            <w:proofErr w:type="gramEnd"/>
-            <w:r>
-              <w:rPr>
-                <w:rFonts w:ascii="Calibri" w:eastAsia="Calibri" w:hAnsi="Calibri" w:cs="Calibri"/>
-              </w:rPr>
-              <w:t>[5]</w:t>
-            </w:r>
-            <w:r>
-              <w:rPr>
-                <w:rFonts w:ascii="Calibri" w:eastAsia="Calibri" w:hAnsi="Calibri" w:cs="Calibri"/>
-              </w:rPr>
-              <w:t>}}</w:t>
+            <w:r>
+              <w:t>{{ row[5]}}</w:t>
+            </w:r>
+          </w:p>
+        </w:tc>
+        <w:tc>
+          <w:tcPr>
+            <w:tcW w:type="dxa" w:w="936"/>
+          </w:tcPr>
+          <w:p>
+            <w:r>
+              <w:t>{{row[6]}}</w:t>
+            </w:r>
+          </w:p>
+        </w:tc>
+        <w:tc>
+          <w:tcPr>
+            <w:tcW w:type="dxa" w:w="936"/>
+          </w:tcPr>
+          <w:p>
+            <w:r>
+              <w:t>{{ row[7]}}</w:t>
             </w:r>
           </w:p>
         </w:tc>
@@ -4793,8 +4346,8 @@
       <w:tr>
         <w:tc>
           <w:tcPr>
-            <w:tcW w:w="10632" w:type="dxa"/>
-            <w:gridSpan w:val="6"/>
+            <w:tcW w:w="12504" w:type="dxa"/>
+            <w:gridSpan w:val="8"/>
             <w:tcBorders>
               <w:top w:val="single" w:sz="4" w:space="0" w:color="000000"/>
               <w:left w:val="single" w:sz="4" w:space="0" w:color="000000"/>
@@ -4803,34 +4356,8 @@
             </w:tcBorders>
           </w:tcPr>
           <w:p>
-            <w:pPr>
-              <w:widowControl w:val="0"/>
-              <w:spacing w:after="0"/>
-              <w:rPr>
-                <w:rFonts w:ascii="Calibri" w:eastAsia="Calibri" w:hAnsi="Calibri" w:cs="Calibri"/>
-                <w:b/>
-                <w:bCs/>
-              </w:rPr>
-            </w:pPr>
-            <w:r>
-              <w:rPr>
-                <w:rFonts w:ascii="Calibri" w:eastAsia="Calibri" w:hAnsi="Calibri" w:cs="Calibri"/>
-              </w:rPr>
-              <w:t xml:space="preserve">{%tr </w:t>
-            </w:r>
-            <w:proofErr w:type="spellStart"/>
-            <w:r>
-              <w:rPr>
-                <w:rFonts w:ascii="Calibri" w:eastAsia="Calibri" w:hAnsi="Calibri" w:cs="Calibri"/>
-              </w:rPr>
-              <w:t>endfor</w:t>
-            </w:r>
-            <w:proofErr w:type="spellEnd"/>
-            <w:r>
-              <w:rPr>
-                <w:rFonts w:ascii="Calibri" w:eastAsia="Calibri" w:hAnsi="Calibri" w:cs="Calibri"/>
-              </w:rPr>
-              <w:t xml:space="preserve"> %}</w:t>
+            <w:r>
+              <w:t>{%tr endfor %}</w:t>
             </w:r>
           </w:p>
         </w:tc>

</xml_diff>